<commit_message>
Sync PRD and Chrome Web Store listing with the Help module and v0.15.0
PRD.md was still describing the product as of v0.13.2 - added the Help
module section, documented the standalone "Apply Negative Filters"
button and keyword-level match detail (both shipped in v0.14.0-0.14.2
but never made it into the PRD), and bumped the version references to
0.15.0. Chrome Web Store Listing.md's sidePanel permission justification
now lists the Help page among its links. Regenerated the matching .docx
for both, and added RELEASE_NOTES.docx (didn't exist yet) as its .docx
pair.
</commit_message>
<xml_diff>
--- a/PRD.docx
+++ b/PRD.docx
@@ -18,7 +18,7 @@
         <w:t xml:space="preserve">Status: </w:t>
       </w:r>
       <w:r>
-        <w:t>Living document, reflects the shipped product as of v0.13.2.</w:t>
+        <w:t>Living document, reflects the shipped product as of v0.15.0.</w:t>
       </w:r>
     </w:p>
     <w:p>
@@ -376,7 +376,7 @@
         <w:pStyle w:val="ListBullet"/>
       </w:pPr>
       <w:r>
-        <w:t>A match sets the lead's status to Irrelevant and records which topic matched (irrelevantReason), shown as a hover tooltip on the Dashboard's status pill — distinct from Dismissed, which is always the salesperson's own decision, never the system's.</w:t>
+        <w:t>A match sets the lead's status to Irrelevant and records both the topic and the specific keyword that matched (irrelevantReason), shown as a hover tooltip on the Dashboard's status pill — distinct from Dismissed, which is always the salesperson's own decision, never the system's.</w:t>
       </w:r>
     </w:p>
     <w:p>
@@ -385,6 +385,14 @@
       </w:pPr>
       <w:r>
         <w:t>“Also re-apply these filters to existing leads on the next scan” checkbox (Scanner tile, unchecked by default, not a saved setting) — when checked, the next scan also re-checks every currently-“New” existing lead against the current negative topics. Never touches a lead already acted on.</w:t>
+      </w:r>
+    </w:p>
+    <w:p>
+      <w:pPr>
+        <w:pStyle w:val="ListBullet"/>
+      </w:pPr>
+      <w:r>
+        <w:t>“Apply Negative Filters” button (Scanner tile, next to the Negative Topics list) — re-checks every existing lead against whatever's currently configured, instantly, with no new scan needed. Fully bidirectional: a “New” lead that now matches becomes Irrelevant, and an “Irrelevant” lead that no longer matches (because a keyword was edited or removed) reverts to “New” — the on-next-scan checkbox above only ever caught the first direction. Reports exactly how many leads moved each way. Never touches a lead already acted on.</w:t>
       </w:r>
     </w:p>
     <w:p>
@@ -585,6 +593,19 @@
     </w:p>
     <w:p>
       <w:pPr>
+        <w:pStyle w:val="Heading3"/>
+      </w:pPr>
+      <w:r>
+        <w:t>6.9 Help</w:t>
+      </w:r>
+    </w:p>
+    <w:p>
+      <w:r>
+        <w:t>A dedicated Help page (its own tab, opened from a “Help ↗” button next to Dashboard/Advisors/Settings): a curated set of Q&amp;A entries covering every feature above, plus a free-text search box. Search is deliberately not an AI feature — no API key needed, instant, and answers are fixed/reviewed rather than generated. Matching is token-overlap across each entry's question and synonym keywords (so “enable a Topic” and “disable a search topic” surface the same entry) with light typo tolerance (edit-distance on individual words). Each result is a collapsible card.</w:t>
+      </w:r>
+    </w:p>
+    <w:p>
+      <w:pPr>
         <w:pStyle w:val="Heading2"/>
       </w:pPr>
       <w:r>
@@ -681,7 +702,7 @@
     </w:p>
     <w:p>
       <w:r>
-        <w:t>See RELEASE_NOTES.md for the full, dated changelog. Current version: 0.13.2.</w:t>
+        <w:t>See RELEASE_NOTES.md for the full, dated changelog. Current version: 0.15.0.</w:t>
       </w:r>
     </w:p>
     <w:sectPr>

</xml_diff>

<commit_message>
v0.19.1: fix Lookalike Topics learning from Job leads
It gathered examples from every lead type but only ever wrote
suggestions into Post Topics. Job leads carry no scraped body text
(only title/company/location), so the AI had nothing to generalize
from except the job title, and echoed it back verbatim - actively
pulling Post Topics toward job-title language whenever most
high-priority leads happened to be Job leads (as reported).

Restricted to Post leads only, widened from P1 to P1-P3. Verified via
harness: only qualifying Post leads reach the AI call, both a
low-priority post and a P1 job lead are correctly excluded.
</commit_message>
<xml_diff>
--- a/PRD.docx
+++ b/PRD.docx
@@ -18,7 +18,7 @@
         <w:t xml:space="preserve">Status: </w:t>
       </w:r>
       <w:r>
-        <w:t>Living document, reflects the shipped product as of v0.19.0.</w:t>
+        <w:t>Living document, reflects the shipped product as of v0.19.1.</w:t>
       </w:r>
     </w:p>
     <w:p>
@@ -336,7 +336,7 @@
         <w:pStyle w:val="ListBullet"/>
       </w:pPr>
       <w:r>
-        <w:t>“Suggest Lookalike Topics” button - looks at the salesperson's own highest-priority (P1, or P1+P2 if there aren't many P1s yet) leads and asks the Sales Mentor what made them strong matches, then suggests new keywords for finding more like them. Review-first like everything else here: each suggestion shows its reasoning and lets the user add it to an existing Topic, create a new one, or skip it - nothing is written until explicitly accepted.</w:t>
+        <w:t>“Suggest Lookalike Topics” button - looks at the salesperson's own highest-priority (P1-P3) Post leads and asks the Sales Mentor what made them strong matches, then suggests new keywords for finding more like them. Post leads only, deliberately: Job leads carry no scraped body text (only title/company/location), so there's nothing to generalize from beyond the title itself, and this only ever writes into Post Topics anyway. Review-first like everything else here: each suggestion shows its reasoning and lets the user add it to an existing Topic, create a new one, or skip it - nothing is written until explicitly accepted.</w:t>
       </w:r>
     </w:p>
     <w:p>
@@ -745,7 +745,7 @@
     </w:p>
     <w:p>
       <w:r>
-        <w:t>See RELEASE_NOTES.md for the full, dated changelog. Current version: 0.19.0.</w:t>
+        <w:t>See RELEASE_NOTES.md for the full, dated changelog. Current version: 0.19.1.</w:t>
       </w:r>
     </w:p>
     <w:sectPr>

</xml_diff>

<commit_message>
v0.20.0: Analyze Post Search Quality
The actual fix for the problem Lookalike Topics can't help with - it
only has good examples to learn from once Posts are already scoring
well. This looks at every unactioned ("New") Post lead plus the
current Topics and Negative Topics together, has the Sales Mentor
diagnose what's likely limiting quality/volume, and proposes specific
keyword changes across both (additions, removals, or a genuinely new
Topic/Negative Topic) - review-first, same pattern as every other
config-mutating flow in the app.

Verified via harness: only qualifying ("New", Post-type) leads reach
the AI call with correct priority-bucket stats; all four suggestion
combinations (add/remove x Topic/Negative Topic) apply correctly to
the right array; an invalid removal (keyword that doesn't actually
exist) is filtered out of the rendered list rather than shown as a
broken action; unchecked suggestions are correctly skipped.
</commit_message>
<xml_diff>
--- a/PRD.docx
+++ b/PRD.docx
@@ -18,7 +18,7 @@
         <w:t xml:space="preserve">Status: </w:t>
       </w:r>
       <w:r>
-        <w:t>Living document, reflects the shipped product as of v0.19.1.</w:t>
+        <w:t>Living document, reflects the shipped product as of v0.20.0.</w:t>
       </w:r>
     </w:p>
     <w:p>
@@ -337,6 +337,14 @@
       </w:pPr>
       <w:r>
         <w:t>“Suggest Lookalike Topics” button - looks at the salesperson's own highest-priority (P1-P3) Post leads and asks the Sales Mentor what made them strong matches, then suggests new keywords for finding more like them. Post leads only, deliberately: Job leads carry no scraped body text (only title/company/location), so there's nothing to generalize from beyond the title itself, and this only ever writes into Post Topics anyway. Review-first like everything else here: each suggestion shows its reasoning and lets the user add it to an existing Topic, create a new one, or skip it - nothing is written until explicitly accepted.</w:t>
+      </w:r>
+    </w:p>
+    <w:p>
+      <w:pPr>
+        <w:pStyle w:val="ListBullet"/>
+      </w:pPr>
+      <w:r>
+        <w:t>“Analyze Post Search Quality” button (Search Quality section, after Negative Topics) - the actual fix for the problem Lookalike Topics can't help with (it only has good examples once Posts already score well). Looks at every unactioned (“New”) Post lead plus the current Topics and Negative Topics together, diagnoses what's likely limiting quality/volume, and proposes specific keyword changes across both - additions, removals, or a genuinely new Topic/Negative Topic. Same review-first pattern: each suggestion can be redirected to a different existing topic or accepted as new, and a removal referencing a keyword that's already gone is filtered out rather than shown as a broken action.</w:t>
       </w:r>
     </w:p>
     <w:p>
@@ -745,7 +753,7 @@
     </w:p>
     <w:p>
       <w:r>
-        <w:t>See RELEASE_NOTES.md for the full, dated changelog. Current version: 0.19.1.</w:t>
+        <w:t>See RELEASE_NOTES.md for the full, dated changelog. Current version: 0.20.0.</w:t>
       </w:r>
     </w:p>
     <w:sectPr>

</xml_diff>

<commit_message>
v0.20.1: fix Analyze Post Search Quality only suggesting Negative Topics
Reported: with zero P1-P3 Post leads, every suggestion was another
Negative Topic - narrowing further, not helping. Root cause: the
analysis never had access to company context, so the Mentor had
nothing to reason from except uniformly mediocre example posts, which
naturally pushes toward "what's wrong with these" rather than "what
would a good one look like" (which requires knowing what to look for).

Now passes company context through, and explicitly tells the model a
Negative Topic can only ever reduce volume, never fix a shortage of
good leads - a zero/few-P1-P3 situation must get positive-keyword
suggestions, not just more narrowing. Verified via harness: the
outgoing prompt now includes company context, the zero-P1-P3 warning,
and the negative-topic-can't-help caveat.
</commit_message>
<xml_diff>
--- a/PRD.docx
+++ b/PRD.docx
@@ -18,7 +18,7 @@
         <w:t xml:space="preserve">Status: </w:t>
       </w:r>
       <w:r>
-        <w:t>Living document, reflects the shipped product as of v0.20.0.</w:t>
+        <w:t>Living document, reflects the shipped product as of v0.20.1.</w:t>
       </w:r>
     </w:p>
     <w:p>
@@ -344,7 +344,7 @@
         <w:pStyle w:val="ListBullet"/>
       </w:pPr>
       <w:r>
-        <w:t>“Analyze Post Search Quality” button (Search Quality section, after Negative Topics) - the actual fix for the problem Lookalike Topics can't help with (it only has good examples once Posts already score well). Looks at every unactioned (“New”) Post lead plus the current Topics and Negative Topics together, diagnoses what's likely limiting quality/volume, and proposes specific keyword changes across both - additions, removals, or a genuinely new Topic/Negative Topic. Same review-first pattern: each suggestion can be redirected to a different existing topic or accepted as new, and a removal referencing a keyword that's already gone is filtered out rather than shown as a broken action.</w:t>
+        <w:t>“Analyze Post Search Quality” button (Search Quality section, after Negative Topics) - the actual fix for the problem Lookalike Topics can't help with (it only has good examples once Posts already score well). Looks at every unactioned (“New”) Post lead plus the current Topics and Negative Topics together, diagnoses what's likely limiting quality/volume, and proposes specific keyword changes across both - additions, removals, or a genuinely new Topic/Negative Topic. Grounded in the configured company context (what the business actually sells) so it can propose genuinely new keywords, not just react to mediocre examples - explicitly told that a Negative Topic can only ever reduce volume, never fix a shortage of good leads, so a “zero/few P1-P3 leads” situation must get positive-keyword suggestions, not just more narrowing. Same review-first pattern: each suggestion can be redirected to a different existing topic or accepted as new, and a removal referencing a keyword that's already gone is filtered out rather than shown as a broken action.</w:t>
       </w:r>
     </w:p>
     <w:p>
@@ -753,7 +753,7 @@
     </w:p>
     <w:p>
       <w:r>
-        <w:t>See RELEASE_NOTES.md for the full, dated changelog. Current version: 0.20.0.</w:t>
+        <w:t>See RELEASE_NOTES.md for the full, dated changelog. Current version: 0.20.1.</w:t>
       </w:r>
     </w:p>
     <w:sectPr>

</xml_diff>

<commit_message>
v0.24.0: Re-score All Priorities, and fix prioritization bias toward thought-leadership posts
Two AI-scored leads clearly didn't deserve their priority: a P3 post that was
just industry-market commentary from someone at an outsourcing company, and a
"Head of AI for IT" post that was really just an AI-news roundup with no
expressed need - both scored high on an impressive title/topic match alone.
Strengthened the prioritization prompt to treat pure thought-leadership/
commentary (no expressed need, project, or hire) as a weak signal regardless
of how senior or on-topic the poster looks.

Added "Re-score All Priorities" on the Dashboard so this fix, and the Ideal
Customer Profile added in v0.23.0, can retroactively apply to leads scored
before either existed - while still leaving any manually-set priority alone.
</commit_message>
<xml_diff>
--- a/PRD.docx
+++ b/PRD.docx
@@ -18,7 +18,7 @@
         <w:t xml:space="preserve">Status: </w:t>
       </w:r>
       <w:r>
-        <w:t>Living document, reflects the shipped product as of v0.23.0.</w:t>
+        <w:t>Living document, reflects the shipped product as of v0.24.0.</w:t>
       </w:r>
     </w:p>
     <w:p>
@@ -485,6 +485,14 @@
         <w:pStyle w:val="ListBullet"/>
       </w:pPr>
       <w:r>
+        <w:t>Guards against the opposite failure too (v0.24.0): a post from someone with an impressive AI-sounding title at a company that clearly already runs AI at scale, that's really just industry commentary or thought leadership - reacting to AI news, sharing opinions/trends - with no expressed need, project, challenge, or hire of its own. Topical overlap and an impressive title aren't buying intent; the prompt now explicitly scores that pattern low (4-5) regardless of how senior or on-topic the poster looks.</w:t>
+      </w:r>
+    </w:p>
+    <w:p>
+      <w:pPr>
+        <w:pStyle w:val="ListBullet"/>
+      </w:pPr>
+      <w:r>
         <w:t>Runs automatically, with no button — visible in the side panel as “prioritizing N new leads…” before “Scan complete.” Silently skipped (never fails the scan) if no Anthropic API key is configured.</w:t>
       </w:r>
     </w:p>
@@ -502,6 +510,14 @@
       </w:pPr>
       <w:r>
         <w:t>“Prioritize Unscored Leads” button (Dashboard) catches up anything the automatic pass never reached — leads that predate the feature, or a scan that ran with no API key — scoring every unscored “New” lead across the entire list, not just what's currently filtered on screen.</w:t>
+      </w:r>
+    </w:p>
+    <w:p>
+      <w:pPr>
+        <w:pStyle w:val="ListBullet"/>
+      </w:pPr>
+      <w:r>
+        <w:t>“Re-score All Priorities” button (Dashboard, v0.24.0) re-runs the Mentor on every already-scored “New” lead too, not just unscored ones - lets a prompt fix or a new/changed Ideal Customer Profile retroactively apply to leads scored before it existed. Same manual-override protection as everywhere else: a lead whose priority was set by hand (no priorityScoredAt) is never touched or resent to the AI. Confirms before running, since it overwrites existing AI-assigned priorities.</w:t>
       </w:r>
     </w:p>
     <w:p>
@@ -761,7 +777,7 @@
     </w:p>
     <w:p>
       <w:r>
-        <w:t>See RELEASE_NOTES.md for the full, dated changelog. Current version: 0.23.0.</w:t>
+        <w:t>See RELEASE_NOTES.md for the full, dated changelog. Current version: 0.24.0.</w:t>
       </w:r>
     </w:p>
     <w:sectPr>

</xml_diff>

<commit_message>
v0.24.1: progress feedback and a real changed-priority count for Re-score All Priorities
Reported: clicking "Re-score All Priorities" gave no sign of whether it had
run, was still working, or finished - the single unbatched AI call across
every eligible lead can genuinely take tens of seconds. Added a live
elapsed-time ticking status (same pattern as long Sales Mentor chat turns),
and the completion message now reports both how many leads were re-scored
and how many actually ended up with a different priority than before.
</commit_message>
<xml_diff>
--- a/PRD.docx
+++ b/PRD.docx
@@ -18,7 +18,7 @@
         <w:t xml:space="preserve">Status: </w:t>
       </w:r>
       <w:r>
-        <w:t>Living document, reflects the shipped product as of v0.24.0.</w:t>
+        <w:t>Living document, reflects the shipped product as of v0.24.1.</w:t>
       </w:r>
     </w:p>
     <w:p>
@@ -517,7 +517,7 @@
         <w:pStyle w:val="ListBullet"/>
       </w:pPr>
       <w:r>
-        <w:t>“Re-score All Priorities” button (Dashboard, v0.24.0) re-runs the Mentor on every already-scored “New” lead too, not just unscored ones - lets a prompt fix or a new/changed Ideal Customer Profile retroactively apply to leads scored before it existed. Same manual-override protection as everywhere else: a lead whose priority was set by hand (no priorityScoredAt) is never touched or resent to the AI. Confirms before running, since it overwrites existing AI-assigned priorities.</w:t>
+        <w:t>“Re-score All Priorities” button (Dashboard, v0.24.0) re-runs the Mentor on every already-scored “New” lead too, not just unscored ones - lets a prompt fix or a new/changed Ideal Customer Profile retroactively apply to leads scored before it existed. Same manual-override protection as everywhere else: a lead whose priority was set by hand (no priorityScoredAt) is never touched or resent to the AI. Confirms before running, since it overwrites existing AI-assigned priorities. Ticks a live elapsed-time status while the (single, unbatched) call is in flight (v0.24.1 - the same pattern used for long Sales Mentor chat turns), and the completion message reports two numbers: how many leads were successfully re-scored, and how many of those actually ended up with a different priority than before.</w:t>
       </w:r>
     </w:p>
     <w:p>
@@ -777,7 +777,7 @@
     </w:p>
     <w:p>
       <w:r>
-        <w:t>See RELEASE_NOTES.md for the full, dated changelog. Current version: 0.24.0.</w:t>
+        <w:t>See RELEASE_NOTES.md for the full, dated changelog. Current version: 0.24.1.</w:t>
       </w:r>
     </w:p>
     <w:sectPr>

</xml_diff>

<commit_message>
v0.24.2: chunk bulk prioritization to fix silent zero-result runs on large batches
Reported: "Re-score All Priorities" ran 70+ seconds on 160 leads and finished
with 0 leads re-scored, 0 changed priority. Root cause: a single AI call for
the whole batch, capped at 8192 output tokens - enough leads (each needing a
priority plus a written reason) could hit that cap mid-generation, coming
back truncated/invalid with no way to distinguish that from "found nothing
to score." Both "Prioritize Unscored Leads" and "Re-score All Priorities"
now send 20 leads per call, applying each chunk as it completes so a later
failure doesn't lose earlier progress - and the status text now shows real
counted progress ("20 of 45 leads") instead of only an elapsed-time guess.
</commit_message>
<xml_diff>
--- a/PRD.docx
+++ b/PRD.docx
@@ -18,7 +18,7 @@
         <w:t xml:space="preserve">Status: </w:t>
       </w:r>
       <w:r>
-        <w:t>Living document, reflects the shipped product as of v0.24.1.</w:t>
+        <w:t>Living document, reflects the shipped product as of v0.24.2.</w:t>
       </w:r>
     </w:p>
     <w:p>
@@ -517,7 +517,15 @@
         <w:pStyle w:val="ListBullet"/>
       </w:pPr>
       <w:r>
-        <w:t>“Re-score All Priorities” button (Dashboard, v0.24.0) re-runs the Mentor on every already-scored “New” lead too, not just unscored ones - lets a prompt fix or a new/changed Ideal Customer Profile retroactively apply to leads scored before it existed. Same manual-override protection as everywhere else: a lead whose priority was set by hand (no priorityScoredAt) is never touched or resent to the AI. Confirms before running, since it overwrites existing AI-assigned priorities. Ticks a live elapsed-time status while the (single, unbatched) call is in flight (v0.24.1 - the same pattern used for long Sales Mentor chat turns), and the completion message reports two numbers: how many leads were successfully re-scored, and how many of those actually ended up with a different priority than before.</w:t>
+        <w:t>“Re-score All Priorities” button (Dashboard, v0.24.0) re-runs the Mentor on every already-scored “New” lead too, not just unscored ones - lets a prompt fix or a new/changed Ideal Customer Profile retroactively apply to leads scored before it existed. Same manual-override protection as everywhere else: a lead whose priority was set by hand (no priorityScoredAt) is never touched or resent to the AI. Confirms before running, since it overwrites existing AI-assigned priorities. The completion message reports two numbers: how many leads were successfully re-scored, and how many of those actually ended up with a different priority than before.</w:t>
+      </w:r>
+    </w:p>
+    <w:p>
+      <w:pPr>
+        <w:pStyle w:val="ListBullet"/>
+      </w:pPr>
+      <w:r>
+        <w:t>Chunked batch prioritization (v0.24.2, applies to both buttons above): a single prioritize_leads call is capped at 8192 output tokens, which a large-enough batch (each lead needs a priority plus a written reason) could exceed mid-generation - coming back truncated/invalid and silently scoring nothing, with no way to tell that apart from “genuinely found nothing to score.” Both buttons now send 20 leads per AI call and apply each chunk's results as soon as it completes (so a later chunk failing doesn't lose earlier progress), and the status text shows real counted progress as each chunk lands - e.g. “Re-scoring 20 of 45 leads with the Sales Mentor…” - rather than only an elapsed-time guess with no sense of how much is left.</w:t>
       </w:r>
     </w:p>
     <w:p>
@@ -777,7 +785,7 @@
     </w:p>
     <w:p>
       <w:r>
-        <w:t>See RELEASE_NOTES.md for the full, dated changelog. Current version: 0.24.1.</w:t>
+        <w:t>See RELEASE_NOTES.md for the full, dated changelog. Current version: 0.24.2.</w:t>
       </w:r>
     </w:p>
     <w:sectPr>

</xml_diff>

<commit_message>
v0.24.3: Ideal Customer Profile mismatch was crushing strong buying signals to P4-5
Reported (with concrete examples): an AI Engineer job ad with LangGraph/
agentic AI/RAG requirements, a contract AI Developer hire using LangChain/
Anthropic at a mental-health practice, and a walk-in AI Developer hire were
all scoring P4-P5 despite a clear, explicit technical fit. isHiringPost/
isJobAd and company extraction were all working correctly - the defect was
in how the prompt weighed things: ICP mismatch (wrong geography/company
size) was overriding an otherwise strong buying-intent signal instead of
just moderating it.

Made Ideal Customer Profile fit an explicit secondary factor in the prompt:
a real, on-topic need outside the exact ICP should typically land around
2-3, not the bottom. The bottom of the range (4-5) is now reserved for no
genuine buying signal at all, an unrelated technical domain, or filtered
noise - not simply "real need, wrong location."
</commit_message>
<xml_diff>
--- a/PRD.docx
+++ b/PRD.docx
@@ -18,7 +18,7 @@
         <w:t xml:space="preserve">Status: </w:t>
       </w:r>
       <w:r>
-        <w:t>Living document, reflects the shipped product as of v0.24.2.</w:t>
+        <w:t>Living document, reflects the shipped product as of v0.24.3.</w:t>
       </w:r>
     </w:p>
     <w:p>
@@ -485,6 +485,14 @@
         <w:pStyle w:val="ListBullet"/>
       </w:pPr>
       <w:r>
+        <w:t>Treats Ideal Customer Profile fit as a secondary, moderating factor, not a pass/fail gate (v0.24.3 - a real bug found via user-supplied examples: an explicit AI-engineer/AI-developer hiring signal was being crushed to P4-5 purely for being outside Switzerland or not “enterprise,” even though isHiringPost/isJobAd and company were all being seen correctly). An on-topic need outside the exact ICP should typically land around 2-3; the bottom of the range (4-5) is reserved for no genuine buying signal at all, a clearly unrelated technical domain, or noise that should already have been filtered.</w:t>
+      </w:r>
+    </w:p>
+    <w:p>
+      <w:pPr>
+        <w:pStyle w:val="ListBullet"/>
+      </w:pPr>
+      <w:r>
         <w:t>Guards against the opposite failure too (v0.24.0): a post from someone with an impressive AI-sounding title at a company that clearly already runs AI at scale, that's really just industry commentary or thought leadership - reacting to AI news, sharing opinions/trends - with no expressed need, project, challenge, or hire of its own. Topical overlap and an impressive title aren't buying intent; the prompt now explicitly scores that pattern low (4-5) regardless of how senior or on-topic the poster looks.</w:t>
       </w:r>
     </w:p>
@@ -785,7 +793,7 @@
     </w:p>
     <w:p>
       <w:r>
-        <w:t>See RELEASE_NOTES.md for the full, dated changelog. Current version: 0.24.2.</w:t>
+        <w:t>See RELEASE_NOTES.md for the full, dated changelog. Current version: 0.24.3.</w:t>
       </w:r>
     </w:p>
     <w:sectPr>

</xml_diff>

<commit_message>
v0.24.4: add Matched Topic and Matched Keywords columns to the Dashboard
Lets "which topic is actually producing leads" or "what keyword is dragging
in this noise" be answered directly in the table - the same data the CSV
export already carried, now sortable/filterable without exporting first.
</commit_message>
<xml_diff>
--- a/PRD.docx
+++ b/PRD.docx
@@ -18,7 +18,7 @@
         <w:t xml:space="preserve">Status: </w:t>
       </w:r>
       <w:r>
-        <w:t>Living document, reflects the shipped product as of v0.24.3.</w:t>
+        <w:t>Living document, reflects the shipped product as of v0.24.4.</w:t>
       </w:r>
     </w:p>
     <w:p>
@@ -565,7 +565,7 @@
         <w:pStyle w:val="ListBullet"/>
       </w:pPr>
       <w:r>
-        <w:t>Table: Post Date, First Scanned, Source, Title, Content (3-line clamp, click to expand), Creator (link), Company, Connection, Status (with Irrelevant-reason tooltip), Priority (P1–P5 colored pill, tooltip shows the Mentor's reason), Last Activity, Actions (Open/Edit, Consult Mentor, Send Message, Assign Company, Dismiss). Every sortable column supports click-to-sort and an Excel-style per-column dropdown (sort asc/desc, free-text filter). Column widths are user-resizable and persisted.</w:t>
+        <w:t>Table: Post Date, First Scanned, Source, Matched Topic / Matched Keywords (v0.24.4 - every Topic this lead matched and the specific keyword(s) that triggered each, deduplicated across topics; the same data the CSV export already carried, now visible and filterable directly in the table), Title, Content (3-line clamp, click to expand), Creator (link), Company, Connection, Status (with Irrelevant-reason tooltip), Priority (P1–P5 colored pill, tooltip shows the Mentor's reason), Last Activity, Actions (Open/Edit, Consult Mentor, Send Message, Assign Company, Dismiss). Every sortable column supports click-to-sort and an Excel-style per-column dropdown (sort asc/desc, free-text filter). Column widths are user-resizable and persisted.</w:t>
       </w:r>
     </w:p>
     <w:p>
@@ -793,7 +793,7 @@
     </w:p>
     <w:p>
       <w:r>
-        <w:t>See RELEASE_NOTES.md for the full, dated changelog. Current version: 0.24.3.</w:t>
+        <w:t>See RELEASE_NOTES.md for the full, dated changelog. Current version: 0.24.4.</w:t>
       </w:r>
     </w:p>
     <w:sectPr>

</xml_diff>

<commit_message>
v0.24.5: fix misleading "0 of N" progress on bulk prioritization
The progress callback fired after each chunk finished, so it always started
at 0 even though the first chunk of 20 was already running. Now fires as
each chunk starts, so the status reads "Re-scoring 20 of 136 leads..." from
the first moment instead of a misleading zero.
</commit_message>
<xml_diff>
--- a/PRD.docx
+++ b/PRD.docx
@@ -18,7 +18,7 @@
         <w:t xml:space="preserve">Status: </w:t>
       </w:r>
       <w:r>
-        <w:t>Living document, reflects the shipped product as of v0.24.4.</w:t>
+        <w:t>Living document, reflects the shipped product as of v0.24.5.</w:t>
       </w:r>
     </w:p>
     <w:p>
@@ -533,7 +533,7 @@
         <w:pStyle w:val="ListBullet"/>
       </w:pPr>
       <w:r>
-        <w:t>Chunked batch prioritization (v0.24.2, applies to both buttons above): a single prioritize_leads call is capped at 8192 output tokens, which a large-enough batch (each lead needs a priority plus a written reason) could exceed mid-generation - coming back truncated/invalid and silently scoring nothing, with no way to tell that apart from “genuinely found nothing to score.” Both buttons now send 20 leads per AI call and apply each chunk's results as soon as it completes (so a later chunk failing doesn't lose earlier progress), and the status text shows real counted progress as each chunk lands - e.g. “Re-scoring 20 of 45 leads with the Sales Mentor…” - rather than only an elapsed-time guess with no sense of how much is left.</w:t>
+        <w:t>Chunked batch prioritization (v0.24.2, applies to both buttons above): a single prioritize_leads call is capped at 8192 output tokens, which a large-enough batch (each lead needs a priority plus a written reason) could exceed mid-generation - coming back truncated/invalid and silently scoring nothing, with no way to tell that apart from “genuinely found nothing to score.” Both buttons now send 20 leads per AI call and apply each chunk's results as soon as it completes (so a later chunk failing doesn't lose earlier progress), and the status text shows real counted progress as each chunk lands - e.g. “Re-scoring 20 of 45 leads with the Sales Mentor…” - rather than only an elapsed-time guess with no sense of how much is left. The count reflects the chunk currently in flight, not only completed work (v0.24.5) - announced as each chunk starts, so the status never sits at a misleading “0 of N” while the first chunk is already running.</w:t>
       </w:r>
     </w:p>
     <w:p>
@@ -793,7 +793,7 @@
     </w:p>
     <w:p>
       <w:r>
-        <w:t>See RELEASE_NOTES.md for the full, dated changelog. Current version: 0.24.4.</w:t>
+        <w:t>See RELEASE_NOTES.md for the full, dated changelog. Current version: 0.24.5.</w:t>
       </w:r>
     </w:p>
     <w:sectPr>

</xml_diff>

<commit_message>
v0.24.6: add total-searches-per-scan estimate to the side panel
Each topic already showed its own "N searches for this topic" hint, but
there was no grand total - a real scan hit 68 sub-queries, discovered only
after starting it. New live total above "Scan All Topics" sums every
enabled Post and Job topic's chunk count (mirroring background.js's
scanAllTopics exactly, including Job Search's additive relationship with
Post topics), recomputing on every topic/checkbox change and warning past
30 total searches.
</commit_message>
<xml_diff>
--- a/PRD.docx
+++ b/PRD.docx
@@ -18,7 +18,7 @@
         <w:t xml:space="preserve">Status: </w:t>
       </w:r>
       <w:r>
-        <w:t>Living document, reflects the shipped product as of v0.24.5.</w:t>
+        <w:t>Living document, reflects the shipped product as of v0.24.6.</w:t>
       </w:r>
     </w:p>
     <w:p>
@@ -320,7 +320,7 @@
         <w:pStyle w:val="ListBullet"/>
       </w:pPr>
       <w:r>
-        <w:t>LinkedIn's own search-complexity limits are worked around automatically via query chunking (max 6 OR-terms per group, 9 total per sub-query) — invisible to the user, who just adds however many keywords they want.</w:t>
+        <w:t>LinkedIn's own search-complexity limits are worked around automatically via query chunking (max 6 OR-terms per group, 9 total per sub-query) - the user can add however many keywords they want, and the cost is made visible rather than hidden: each topic shows its own live “N searches for this topic” hint, and a grand total across every enabled Post and Job topic (“Total: 76 searches this scan will run (Posts: 60, Jobs: 16)”) sits above the “Scan All Topics” button, turning orange past 30 - found necessary once a user's own topic redesign (adding a large bilingual AND-topic to chase a previously-empty topic) pushed one real scan to 68 sub-queries, discovered only after starting it.</w:t>
       </w:r>
     </w:p>
     <w:p>
@@ -793,7 +793,7 @@
     </w:p>
     <w:p>
       <w:r>
-        <w:t>See RELEASE_NOTES.md for the full, dated changelog. Current version: 0.24.5.</w:t>
+        <w:t>See RELEASE_NOTES.md for the full, dated changelog. Current version: 0.24.6.</w:t>
       </w:r>
     </w:p>
     <w:sectPr>

</xml_diff>

<commit_message>
v0.26.1: Activity Log now updates live instead of requiring a manual reload
Reported immediately after v0.26.0 shipped: clearing results and starting a
scan while the Activity Log tab was already open only showed the "Cleared
results" entry - the scan's own logging never appeared until reloaded. The
page loaded its data once on open and never refreshed. Fixed by adding the
same chrome.storage.onChanged listener the Dashboard/Advisors pages already
use for their own storage reads.
</commit_message>
<xml_diff>
--- a/PRD.docx
+++ b/PRD.docx
@@ -18,7 +18,7 @@
         <w:t xml:space="preserve">Status: </w:t>
       </w:r>
       <w:r>
-        <w:t>Living document, reflects the shipped product as of v0.26.0.</w:t>
+        <w:t>Living document, reflects the shipped product as of v0.26.1.</w:t>
       </w:r>
     </w:p>
     <w:p>
@@ -763,6 +763,14 @@
     </w:p>
     <w:p>
       <w:pPr>
+        <w:pStyle w:val="ListBullet"/>
+      </w:pPr>
+      <w:r>
+        <w:t>Updates live via chrome.storage.onChanged (v0.26.1) - a scan can log many entries over its whole run, and this page doesn't require a manual reload to see them, the same reactive pattern the Dashboard/Advisors pages already use for their own storage reads.</w:t>
+      </w:r>
+    </w:p>
+    <w:p>
+      <w:pPr>
         <w:pStyle w:val="Heading2"/>
       </w:pPr>
       <w:r>
@@ -867,7 +875,7 @@
     </w:p>
     <w:p>
       <w:r>
-        <w:t>See RELEASE_NOTES.md for the full, dated changelog. Current version: 0.26.0.</w:t>
+        <w:t>See RELEASE_NOTES.md for the full, dated changelog. Current version: 0.26.1.</w:t>
       </w:r>
     </w:p>
     <w:sectPr>

</xml_diff>

<commit_message>
v0.26.2: Activity Log is now never clearable, plus full tooltip coverage
"Please remove this Clear Log button. I do not want to delete the activity
log ever. It is my only way to investigate if anything broke."

- Removed the Clear Log button and clearActivityLog() entirely.
- Replaced the 2000-entry cap (a raw count that could drop recent history
  during one unusually active day) with a 90-day retention window instead:
  one array per calendar day, pruned automatically on every write. Existing
  log data from the old flat-key scheme migrates automatically on next read.
- Finished the hover-tooltip pass: every remaining untitled button across
  the Dashboard (including the lead detail/edit page, Bulk Change, Assign
  Company), Advisors, and Help now has a title.

Verified via harness: correct day-bucketing, 90-day pruning (old bucket
removed, recent one kept), and legacy-log migration into per-day buckets.
</commit_message>
<xml_diff>
--- a/PRD.docx
+++ b/PRD.docx
@@ -18,7 +18,7 @@
         <w:t xml:space="preserve">Status: </w:t>
       </w:r>
       <w:r>
-        <w:t>Living document, reflects the shipped product as of v0.26.1.</w:t>
+        <w:t>Living document, reflects the shipped product as of v0.26.2.</w:t>
       </w:r>
     </w:p>
     <w:p>
@@ -758,7 +758,7 @@
         <w:pStyle w:val="ListBullet"/>
       </w:pPr>
       <w:r>
-        <w:t>Capped at 2000 entries (oldest dropped first) - no unlimitedStorage permission is declared (5MB real chrome.storage.local quota) and nothing else in the app guards against quota exhaustion, so the log is deliberately self-limiting. Filterable by actor/free-text/errors-only; a confirm-gated “Clear Log” resets only the log itself, never any lead or setting.</w:t>
+        <w:t>Capped at 2000 entries (oldest dropped first) - no unlimitedStorage permission is declared (5MB real chrome.storage.local quota) and nothing else in the app guards against quota exhaustion, so the log is Never manually clearable (v0.26.2) - this is the one place to investigate what happened after something looks wrong, so no action anywhere deletes it. Stored as one array per calendar day (activityLog:YYYY-MM-DD) rather than one shared array; anything older than a 90-day retention window is pruned automatically on every write - a predictable “always the last 90 days” guarantee, not a raw entry-count cap that could exhaust itself faster during a single unusually active day. Log data from the earlier flat single-key scheme migrates automatically (bucketed by each entry's own timestamp) the first time it's read.</w:t>
       </w:r>
     </w:p>
     <w:p>
@@ -875,7 +875,7 @@
     </w:p>
     <w:p>
       <w:r>
-        <w:t>See RELEASE_NOTES.md for the full, dated changelog. Current version: 0.26.1.</w:t>
+        <w:t>See RELEASE_NOTES.md for the full, dated changelog. Current version: 0.26.2.</w:t>
       </w:r>
     </w:p>
     <w:sectPr>

</xml_diff>

<commit_message>
v0.27.1: warn when the extension comes up completely empty
Reported after v0.27.0's folder move: reinstalling pointed at the new /code
location came up with zero leads and zero settings, with no explanation.
The data wasn't actually lost (Chrome ties an unpacked extension's storage
to its install location, not its code - a different path is a different
extension with blank storage, and no API lets a new install read an old
one's storage to auto-migrate it), but there was no in-app indication of
what happened or what to do about it.

Added a banner in the side panel, shown whenever it finds zero Topics/Job
Topics and zero leads, pointing directly at Import Settings/Import Leads
instead of an unexplained blank slate. Worded to also make sense for a
genuinely new install with nothing to restore.

/code is now the permanent install location going forward, so this
shouldn't recur - every future update edits those files in place.
</commit_message>
<xml_diff>
--- a/PRD.docx
+++ b/PRD.docx
@@ -18,7 +18,7 @@
         <w:t xml:space="preserve">Status: </w:t>
       </w:r>
       <w:r>
-        <w:t>Living document, reflects the shipped product as of v0.27.0.</w:t>
+        <w:t>Living document, reflects the shipped product as of v0.27.1.</w:t>
       </w:r>
     </w:p>
     <w:p>
@@ -785,6 +785,17 @@
       </w:r>
     </w:p>
     <w:p>
+      <w:r>
+        <w:rPr>
+          <w:b/>
+        </w:rPr>
+        <w:t xml:space="preserve">Empty-install warning (v0.27.1): </w:t>
+      </w:r>
+      <w:r>
+        <w:t>Chrome ties an unpacked extension's storage to its install location, not its code - moving or reinstalling from a different path starts genuinely blank even though the old data still exists in a backup file, and no API lets a new install read an old one's storage to auto-migrate it. The side panel shows a banner whenever it finds zero Topics/Job Topics and zero leads, pointing directly at Import Settings/Import Leads instead of leaving an unexplained blank slate - worded to also make sense for a genuinely new install.</w:t>
+      </w:r>
+    </w:p>
+    <w:p>
       <w:pPr>
         <w:pStyle w:val="Heading3"/>
       </w:pPr>
@@ -964,7 +975,7 @@
     </w:p>
     <w:p>
       <w:r>
-        <w:t>See RELEASE_NOTES.md for the full, dated changelog. Current version: 0.27.0.</w:t>
+        <w:t>See RELEASE_NOTES.md for the full, dated changelog. Current version: 0.27.1.</w:t>
       </w:r>
     </w:p>
     <w:sectPr>

</xml_diff>

<commit_message>
Fix crash in Extract Companies from Profiles on a per-profile timeout
Reported: a real run stopped after 3 of 55 profiles with "Cannot
destructure property 'company' of '(intermediate value)' as it is null."
waitForProfileScrapeResult resolved a bare null when a profile didn't
respond within its 15s timeout, and destructuring null throws - aborting
the whole run instead of skipping that one unresponsive profile. The
timeout path now resolves {company: null, location: null} instead.

Co-Authored-By: Claude Sonnet 5 <noreply@anthropic.com>
</commit_message>
<xml_diff>
--- a/PRD.docx
+++ b/PRD.docx
@@ -18,7 +18,7 @@
         <w:t xml:space="preserve">Status: </w:t>
       </w:r>
       <w:r>
-        <w:t>Living document, reflects the shipped product as of v0.29.5.</w:t>
+        <w:t>Living document, reflects the shipped product as of v0.29.6.</w:t>
       </w:r>
     </w:p>
     <w:p>
@@ -553,7 +553,7 @@
         <w:t xml:space="preserve">Extract Companies from Profiles (v0.29.1, opt-in, Dashboard-only): </w:t>
       </w:r>
       <w:r>
-        <w:t>the AI extraction above can only find a company that's actually present in the scraped headline text - and a LinkedIn search-results feed only ever shows a poster's own short headline, never their full profile. Confirmed live: a real profile page often shows a structured current employer that the person's headline never mentions at all. Fixing that requires visiting the person's own profile page, a materially bigger LinkedIn scraping footprint than reading a search-results feed - so this is a separate, explicit, manual Dashboard button, never part of the automatic per-scan pipeline. Filters to Post leads still missing a company with a profileUrl; confirms first, naming the real scope; visits one profile at a time in a background tab, paced with a randomized 4-9s delay between visits; reuses the same never-overwrite write path (applyExtractedCompanies) as headline extraction. A new content script (profile-content-script.js) only runs during this explicit action, gated on a profileExtractionActive flag, so ordinary profile browsing is never scraped. Fixed in v0.29.5 after a real 20-profile run returned 0 companies: LinkedIn's current profile page hydrates its Experience section in after the page's load event, so the extractor now polls for up to ~6s for it to appear; also, the company-page link wraps both the job title and company name as one text block, so it now reads the specific line holding the company name and strips the trailing employment-type suffix. The Experience-section lookup itself was also hardened to anchor on the section's own literal 'Experience' heading text rather than an id/class guess. Extended in v0.29.5 to also extract the person's stated location from the same visit (still unverified against a live sample), feeding the new Location Filter (6.13).</w:t>
+        <w:t>the AI extraction above can only find a company that's actually present in the scraped headline text - and a LinkedIn search-results feed only ever shows a poster's own short headline, never their full profile. Confirmed live: a real profile page often shows a structured current employer that the person's headline never mentions at all. Fixing that requires visiting the person's own profile page, a materially bigger LinkedIn scraping footprint than reading a search-results feed - so this is a separate, explicit, manual Dashboard button, never part of the automatic per-scan pipeline. Filters to Post leads still missing a company with a profileUrl; confirms first, naming the real scope; visits one profile at a time in a background tab, paced with a randomized 4-9s delay between visits; reuses the same never-overwrite write path (applyExtractedCompanies) as headline extraction. A new content script (profile-content-script.js) only runs during this explicit action, gated on a profileExtractionActive flag, so ordinary profile browsing is never scraped. Fixed in v0.29.5 after a real 20-profile run returned 0 companies: LinkedIn's current profile page hydrates its Experience section in after the page's load event, so the extractor now polls for up to ~6s for it to appear; also, the company-page link wraps both the job title and company name as one text block, so it now reads the specific line holding the company name and strips the trailing employment-type suffix. The Experience-section lookup itself was also hardened to anchor on the section's own literal 'Experience' heading text rather than an id/class guess. Extended in v0.29.5 to also extract the person's stated location from the same visit (still unverified against a live sample), feeding the new Location Filter (6.13). Fixed in v0.29.6: a real run still crashed after 3 of 55 profiles - the orchestration resolved a bare null on a per-profile timeout, and destructuring null throws, aborting the whole run instead of skipping that one unresponsive profile; the timeout path now resolves an empty company/location pair instead.</w:t>
       </w:r>
     </w:p>
     <w:p>
@@ -1212,7 +1212,7 @@
     </w:p>
     <w:p>
       <w:r>
-        <w:t>See RELEASE_NOTES.md for the full, dated changelog. Current version: 0.29.5.</w:t>
+        <w:t>See RELEASE_NOTES.md for the full, dated changelog. Current version: 0.29.6.</w:t>
       </w:r>
     </w:p>
     <w:sectPr>

</xml_diff>

<commit_message>
Replace free-text country list with a dual-listbox picker; add Settings-wide save indicator
Location Filter country selection was free-text (one per line), which
silently failed to match on any misspelling or unrecognized alternate
country name. Replaced with a searchable dual-listbox picker sourced from
ALL_COUNTRIES (the same list classifyLocation matches against), so a
selected country is guaranteed to match exactly. The picker also stages
changes locally and only persists on an explicit "Save Countries" click,
so building up a list doesn't write on every single move.

Also added a persistent, page-wide "Saved" indicator to Settings: every
field still auto-saves (kept - an explicit Save-everywhere model risks
losing an edit on navigation away), but the auto-save was invisible and
left the user unsure whether a change had actually taken effect.

Co-Authored-By: Claude Sonnet 5 <noreply@anthropic.com>
</commit_message>
<xml_diff>
--- a/PRD.docx
+++ b/PRD.docx
@@ -18,7 +18,7 @@
         <w:t xml:space="preserve">Status: </w:t>
       </w:r>
       <w:r>
-        <w:t>Living document, reflects the shipped product as of v0.29.6.</w:t>
+        <w:t>Living document, reflects the shipped product as of v0.29.7.</w:t>
       </w:r>
     </w:p>
     <w:p>
@@ -779,6 +779,14 @@
     </w:p>
     <w:p>
       <w:pPr>
+        <w:pStyle w:val="ListBullet"/>
+      </w:pPr>
+      <w:r>
+        <w:t>Persistent “Saved” indicator (v0.29.7) - every field here already auto-saves on change (kept deliberately - an explicit Save-everywhere model risks losing an edit if the user navigates away without clicking it), but that auto-save is invisible. A fixed, page-wide badge now flashes Saved on every write across the whole page and settles back to All changes saved a moment later. The Location Filter's country picker (6.13) is the one exception: it stages changes and requires its own explicit Save click, so it also gets its own local Unsaved changes/Saved status alongside this page-wide one.</w:t>
+      </w:r>
+    </w:p>
+    <w:p>
+      <w:pPr>
         <w:pStyle w:val="Heading3"/>
       </w:pPr>
       <w:r>
@@ -1063,7 +1071,7 @@
         <w:pStyle w:val="ListBullet"/>
       </w:pPr>
       <w:r>
-        <w:t>Configuration lives in Settings (6.7), one of three modes: Off (default), By continent (six checkboxes: North America, Latin America, Europe including UK and Switzerland, Africa, Middle East, South East Asia), or By country (a free-text list, one per line). The six continents mirror standard Americas/EMEA/APAC sales territories, split one level further; since they don't geographically cover the whole world on their own, the remaining regions fold into South East Asia rather than adding a seventh Other bucket.</w:t>
+        <w:t>Configuration lives in Settings (6.7), one of three modes: Off (default), By continent (six checkboxes: North America, Latin America, Europe including UK and Switzerland, Africa, Middle East, South East Asia), or By country - a dual-listbox picker (v0.29.7, replacing an initial free-text textarea): a searchable, alphabetized list of every recognized country on the left, an arrow pair (or double-click) to move a selection into the filter on the right. Only ever offers names from ALL_COUNTRIES (the same list classifyLocation matches against), so a selected country is guaranteed to match exactly - a misspelling is no longer possible. Stages changes locally and only saves (one write, one activity-log entry) when its own Save Countries button is clicked. The six continents mirror standard Americas/EMEA/APAC sales territories, split one level further; since they don't geographically cover the whole world on their own, the remaining regions fold into South East Asia rather than adding a seventh Other bucket.</w:t>
       </w:r>
     </w:p>
     <w:p>
@@ -1212,7 +1220,7 @@
     </w:p>
     <w:p>
       <w:r>
-        <w:t>See RELEASE_NOTES.md for the full, dated changelog. Current version: 0.29.6.</w:t>
+        <w:t>See RELEASE_NOTES.md for the full, dated changelog. Current version: 0.29.7.</w:t>
       </w:r>
     </w:p>
     <w:sectPr>

</xml_diff>

<commit_message>
Correct the "Extract Companies from Profiles" time estimate
Reported: a real 55-profile run took ~15 minutes against a confirmation
dialog that implied 1.5-3. The estimate only ever counted the deliberate
pacing delay between profiles, never the actual page-navigation/load time
(up to a 20s ceiling) - the dominant, most variable real-world cost. Now
folds in a rough typical page-load time too, and the dialog notes that
real page-load time varies. No change to actual extraction behavior or
timeouts, only to the estimate shown before starting.

Co-Authored-By: Claude Sonnet 5 <noreply@anthropic.com>
</commit_message>
<xml_diff>
--- a/PRD.docx
+++ b/PRD.docx
@@ -18,7 +18,7 @@
         <w:t xml:space="preserve">Status: </w:t>
       </w:r>
       <w:r>
-        <w:t>Living document, reflects the shipped product as of v0.29.7.</w:t>
+        <w:t>Living document, reflects the shipped product as of v0.29.8.</w:t>
       </w:r>
     </w:p>
     <w:p>
@@ -553,7 +553,7 @@
         <w:t xml:space="preserve">Extract Companies from Profiles (v0.29.1, opt-in, Dashboard-only): </w:t>
       </w:r>
       <w:r>
-        <w:t>the AI extraction above can only find a company that's actually present in the scraped headline text - and a LinkedIn search-results feed only ever shows a poster's own short headline, never their full profile. Confirmed live: a real profile page often shows a structured current employer that the person's headline never mentions at all. Fixing that requires visiting the person's own profile page, a materially bigger LinkedIn scraping footprint than reading a search-results feed - so this is a separate, explicit, manual Dashboard button, never part of the automatic per-scan pipeline. Filters to Post leads still missing a company with a profileUrl; confirms first, naming the real scope; visits one profile at a time in a background tab, paced with a randomized 4-9s delay between visits; reuses the same never-overwrite write path (applyExtractedCompanies) as headline extraction. A new content script (profile-content-script.js) only runs during this explicit action, gated on a profileExtractionActive flag, so ordinary profile browsing is never scraped. Fixed in v0.29.5 after a real 20-profile run returned 0 companies: LinkedIn's current profile page hydrates its Experience section in after the page's load event, so the extractor now polls for up to ~6s for it to appear; also, the company-page link wraps both the job title and company name as one text block, so it now reads the specific line holding the company name and strips the trailing employment-type suffix. The Experience-section lookup itself was also hardened to anchor on the section's own literal 'Experience' heading text rather than an id/class guess. Extended in v0.29.5 to also extract the person's stated location from the same visit (still unverified against a live sample), feeding the new Location Filter (6.13). Fixed in v0.29.6: a real run still crashed after 3 of 55 profiles - the orchestration resolved a bare null on a per-profile timeout, and destructuring null throws, aborting the whole run instead of skipping that one unresponsive profile; the timeout path now resolves an empty company/location pair instead.</w:t>
+        <w:t>the AI extraction above can only find a company that's actually present in the scraped headline text - and a LinkedIn search-results feed only ever shows a poster's own short headline, never their full profile. Confirmed live: a real profile page often shows a structured current employer that the person's headline never mentions at all. Fixing that requires visiting the person's own profile page, a materially bigger LinkedIn scraping footprint than reading a search-results feed - so this is a separate, explicit, manual Dashboard button, never part of the automatic per-scan pipeline. Filters to Post leads still missing a company with a profileUrl; confirms first, naming the real scope; visits one profile at a time in a background tab, paced with a randomized 4-9s delay between visits; reuses the same never-overwrite write path (applyExtractedCompanies) as headline extraction. A new content script (profile-content-script.js) only runs during this explicit action, gated on a profileExtractionActive flag, so ordinary profile browsing is never scraped. Fixed in v0.29.5 after a real 20-profile run returned 0 companies: LinkedIn's current profile page hydrates its Experience section in after the page's load event, so the extractor now polls for up to ~6s for it to appear; also, the company-page link wraps both the job title and company name as one text block, so it now reads the specific line holding the company name and strips the trailing employment-type suffix. The Experience-section lookup itself was also hardened to anchor on the section's own literal 'Experience' heading text rather than an id/class guess. Extended in v0.29.5 to also extract the person's stated location from the same visit (still unverified against a live sample), feeding the new Location Filter (6.13). Fixed in v0.29.6: a real run still crashed after 3 of 55 profiles - the orchestration resolved a bare null on a per-profile timeout, and destructuring null throws, aborting the whole run instead of skipping that one unresponsive profile; the timeout path now resolves an empty company/location pair instead. Fixed in v0.29.8: the confirmation dialog's time estimate only ever counted the pacing delay, not real page-load time (the dominant, most variable cost) - a real 55-profile run took ~15 minutes against an estimate implying 1.5-3; the estimate now folds in a rough typical page-load time too.</w:t>
       </w:r>
     </w:p>
     <w:p>
@@ -1220,7 +1220,7 @@
     </w:p>
     <w:p>
       <w:r>
-        <w:t>See RELEASE_NOTES.md for the full, dated changelog. Current version: 0.29.7.</w:t>
+        <w:t>See RELEASE_NOTES.md for the full, dated changelog. Current version: 0.29.8.</w:t>
       </w:r>
     </w:p>
     <w:sectPr>

</xml_diff>